<commit_message>
docs: actualiza diagramas y documentacion de trim02 y trim03
- Diagrama de clases: agrega la clase carrito_chatbot, el atributo
  total_efectivo en arqueo_caja y retira carrito JSON de
  sesiones_chatbot, conforme a la migracion 04
- Diagrama de despliegue: corrige el conteo del script a 14 tablas
- Agrega la sustentacion de la actualizacion del diagrama de clases
- Agrega los diagramas de casos de uso de los modulos 1 a 5
- Agrega el enlace del prototipo de interfaces en Figma
- Reemplaza la presentacion de contextualizacion y el mapa de procesos
</commit_message>
<xml_diff>
--- a/_docs_/trim03/02_normalizacion/Bitacora_Base_Datos_ControlStore.docx
+++ b/_docs_/trim03/02_normalizacion/Bitacora_Base_Datos_ControlStore.docx
@@ -5102,6 +5102,1779 @@
           <w:b/>
           <w:sz w:val="24"/>
         </w:rPr>
+        <w:t xml:space="preserve">Ampliación de la Carga de Datos (25 de septiembre de 2026)</w:t>
+      </w:r>
+    </w:p>
+    <w:tbl>
+      <w:tblPr>
+        <w:tblStyle w:val="TableGrid"/>
+        <w:tblW w:type="auto" w:w="0"/>
+        <w:tblLook w:firstColumn="1" w:firstRow="1" w:lastColumn="0" w:lastRow="0" w:noHBand="0" w:noVBand="1" w:val="04A0"/>
+      </w:tblPr>
+      <w:tblGrid>
+        <w:gridCol w:w="4680"/>
+        <w:gridCol w:w="4680"/>
+      </w:tblGrid>
+      <w:tr>
+        <w:tc>
+          <w:tcPr>
+            <w:tcW w:type="dxa" w:w="2041"/>
+            <w:shd w:fill="EDF1F8"/>
+          </w:tcPr>
+          <w:p>
+            <w:pPr>
+              <w:spacing w:after="0"/>
+            </w:pPr>
+            <w:r/>
+            <w:r>
+              <w:rPr>
+                <w:rFonts w:ascii="Times New Roman" w:hAnsi="Times New Roman"/>
+                <w:b/>
+                <w:sz w:val="20"/>
+              </w:rPr>
+              <w:t xml:space="preserve">Fecha</w:t>
+            </w:r>
+          </w:p>
+        </w:tc>
+        <w:tc>
+          <w:tcPr>
+            <w:tcW w:type="dxa" w:w="7030"/>
+          </w:tcPr>
+          <w:p>
+            <w:pPr>
+              <w:spacing w:after="0"/>
+            </w:pPr>
+            <w:r/>
+            <w:r>
+              <w:rPr>
+                <w:rFonts w:ascii="Times New Roman" w:hAnsi="Times New Roman"/>
+                <w:sz w:val="20"/>
+              </w:rPr>
+              <w:t xml:space="preserve">25 de septiembre de 2026</w:t>
+            </w:r>
+          </w:p>
+        </w:tc>
+      </w:tr>
+      <w:tr>
+        <w:tc>
+          <w:tcPr>
+            <w:tcW w:type="dxa" w:w="2041"/>
+            <w:shd w:fill="EDF1F8"/>
+          </w:tcPr>
+          <w:p>
+            <w:pPr>
+              <w:spacing w:after="0"/>
+            </w:pPr>
+            <w:r/>
+            <w:r>
+              <w:rPr>
+                <w:rFonts w:ascii="Times New Roman" w:hAnsi="Times New Roman"/>
+                <w:b/>
+                <w:sz w:val="20"/>
+              </w:rPr>
+              <w:t xml:space="preserve">Script</w:t>
+            </w:r>
+          </w:p>
+        </w:tc>
+        <w:tc>
+          <w:tcPr>
+            <w:tcW w:type="dxa" w:w="7030"/>
+          </w:tcPr>
+          <w:p>
+            <w:pPr>
+              <w:spacing w:after="0"/>
+            </w:pPr>
+            <w:r/>
+            <w:r>
+              <w:rPr>
+                <w:rFonts w:ascii="Times New Roman" w:hAnsi="Times New Roman"/>
+                <w:sz w:val="20"/>
+              </w:rPr>
+              <w:t xml:space="preserve">03_datos_diez_por_tabla.sql</w:t>
+            </w:r>
+          </w:p>
+        </w:tc>
+      </w:tr>
+      <w:tr>
+        <w:tc>
+          <w:tcPr>
+            <w:tcW w:type="dxa" w:w="2041"/>
+            <w:shd w:fill="EDF1F8"/>
+          </w:tcPr>
+          <w:p>
+            <w:pPr>
+              <w:spacing w:after="0"/>
+            </w:pPr>
+            <w:r/>
+            <w:r>
+              <w:rPr>
+                <w:rFonts w:ascii="Times New Roman" w:hAnsi="Times New Roman"/>
+                <w:b/>
+                <w:sz w:val="20"/>
+              </w:rPr>
+              <w:t xml:space="preserve">Estado</w:t>
+            </w:r>
+          </w:p>
+        </w:tc>
+        <w:tc>
+          <w:tcPr>
+            <w:tcW w:type="dxa" w:w="7030"/>
+          </w:tcPr>
+          <w:p>
+            <w:pPr>
+              <w:spacing w:after="0"/>
+            </w:pPr>
+            <w:r/>
+            <w:r>
+              <w:rPr>
+                <w:rFonts w:ascii="Times New Roman" w:hAnsi="Times New Roman"/>
+                <w:sz w:val="20"/>
+              </w:rPr>
+              <w:t xml:space="preserve">Escrito y probado; pendiente de ejecutar en controlstore_sena</w:t>
+            </w:r>
+          </w:p>
+        </w:tc>
+      </w:tr>
+      <w:tr>
+        <w:tc>
+          <w:tcPr>
+            <w:tcW w:type="dxa" w:w="2041"/>
+            <w:shd w:fill="EDF1F8"/>
+          </w:tcPr>
+          <w:p>
+            <w:pPr>
+              <w:spacing w:after="0"/>
+            </w:pPr>
+            <w:r/>
+            <w:r>
+              <w:rPr>
+                <w:rFonts w:ascii="Times New Roman" w:hAnsi="Times New Roman"/>
+                <w:b/>
+                <w:sz w:val="20"/>
+              </w:rPr>
+              <w:t xml:space="preserve">Motivo</w:t>
+            </w:r>
+          </w:p>
+        </w:tc>
+        <w:tc>
+          <w:tcPr>
+            <w:tcW w:type="dxa" w:w="7030"/>
+          </w:tcPr>
+          <w:p>
+            <w:pPr>
+              <w:spacing w:after="0"/>
+            </w:pPr>
+            <w:r/>
+            <w:r>
+              <w:rPr>
+                <w:rFonts w:ascii="Times New Roman" w:hAnsi="Times New Roman"/>
+                <w:sz w:val="20"/>
+              </w:rPr>
+              <w:t xml:space="preserve">Al menos diez registros por tabla para la sustentación de la normalización</w:t>
+            </w:r>
+          </w:p>
+        </w:tc>
+      </w:tr>
+      <w:tr>
+        <w:tc>
+          <w:tcPr>
+            <w:tcW w:type="dxa" w:w="2041"/>
+            <w:shd w:fill="EDF1F8"/>
+          </w:tcPr>
+          <w:p>
+            <w:pPr>
+              <w:spacing w:after="0"/>
+            </w:pPr>
+            <w:r/>
+            <w:r>
+              <w:rPr>
+                <w:rFonts w:ascii="Times New Roman" w:hAnsi="Times New Roman"/>
+                <w:b/>
+                <w:sz w:val="20"/>
+              </w:rPr>
+              <w:t xml:space="preserve">Tablas afectadas</w:t>
+            </w:r>
+          </w:p>
+        </w:tc>
+        <w:tc>
+          <w:tcPr>
+            <w:tcW w:type="dxa" w:w="7030"/>
+          </w:tcPr>
+          <w:p>
+            <w:pPr>
+              <w:spacing w:after="0"/>
+            </w:pPr>
+            <w:r/>
+            <w:r>
+              <w:rPr>
+                <w:rFonts w:ascii="Times New Roman" w:hAnsi="Times New Roman"/>
+                <w:sz w:val="20"/>
+              </w:rPr>
+              <w:t xml:space="preserve">Las 14 (solo inserciones; no cambia la estructura)</w:t>
+            </w:r>
+          </w:p>
+        </w:tc>
+      </w:tr>
+    </w:tbl>
+    <w:p>
+      <w:pPr>
+        <w:spacing w:line="240" w:lineRule="auto" w:before="0" w:after="200"/>
+        <w:ind w:firstLine="720"/>
+        <w:jc w:val="both"/>
+      </w:pPr>
+      <w:r>
+        <w:rPr>
+          <w:rFonts w:ascii="Times New Roman" w:hAnsi="Times New Roman"/>
+          <w:b w:val="0"/>
+          <w:i w:val="0"/>
+          <w:sz w:val="24"/>
+        </w:rPr>
+        <w:t xml:space="preserve">Para sustentar la normalización tabla por tabla se requería que cada una de las catorce tablas tuviera al menos diez registros. El script 03_datos_diez_por_tabla.sql agrega los datos que faltan sin borrar ni modificar la estructura. Los identificadores se escriben de manera explícita para que los documentos puedan citar cada registro, y todo el script va dentro de una transacción: si se ejecuta dos veces, se detiene en el primer INSERT con el error 1062 y no agrega nada.</w:t>
+      </w:r>
+    </w:p>
+    <w:p>
+      <w:pPr>
+        <w:spacing w:line="240" w:lineRule="auto" w:before="0" w:after="200"/>
+        <w:ind w:firstLine="720"/>
+        <w:jc w:val="both"/>
+      </w:pPr>
+      <w:r>
+        <w:rPr>
+          <w:rFonts w:ascii="Times New Roman" w:hAnsi="Times New Roman"/>
+          <w:b w:val="0"/>
+          <w:i w:val="0"/>
+          <w:sz w:val="24"/>
+        </w:rPr>
+        <w:t xml:space="preserve">Como en la carga del 23 de septiembre, ningún total se escribió a mano: los disparadores calcularon ventas.total, el motor calculó subtotal y diferencia, y el stock de los productos se recalculó a partir de los movimientos del kárdex. Tres tablas superan los diez registros por una razón del modelo: diez domicilios exigen diez ventas distintas, cada venta tiene al menos un renglón y cada renglón genera una salida en el kárdex.</w:t>
+      </w:r>
+    </w:p>
+    <w:p>
+      <w:pPr>
+        <w:spacing w:before="200" w:after="0"/>
+      </w:pPr>
+      <w:r>
+        <w:rPr>
+          <w:rFonts w:ascii="Times New Roman" w:hAnsi="Times New Roman"/>
+          <w:b/>
+          <w:sz w:val="24"/>
+        </w:rPr>
+        <w:t xml:space="preserve">Tabla 7</w:t>
+      </w:r>
+    </w:p>
+    <w:p>
+      <w:pPr>
+        <w:spacing w:after="80"/>
+      </w:pPr>
+      <w:r>
+        <w:rPr>
+          <w:rFonts w:ascii="Times New Roman" w:hAnsi="Times New Roman"/>
+          <w:i/>
+          <w:sz w:val="24"/>
+        </w:rPr>
+        <w:t xml:space="preserve">Registros por tabla antes y después de la ampliación</w:t>
+      </w:r>
+    </w:p>
+    <w:tbl>
+      <w:tblPr>
+        <w:tblStyle w:val="TableGrid"/>
+        <w:tblW w:type="auto" w:w="0"/>
+        <w:jc w:val="center"/>
+        <w:tblLook w:firstColumn="1" w:firstRow="1" w:lastColumn="0" w:lastRow="0" w:noHBand="0" w:noVBand="1" w:val="04A0"/>
+      </w:tblPr>
+      <w:tblGrid>
+        <w:gridCol w:w="3120"/>
+        <w:gridCol w:w="3120"/>
+        <w:gridCol w:w="3120"/>
+      </w:tblGrid>
+      <w:tr>
+        <w:tc>
+          <w:tcPr>
+            <w:tcW w:type="dxa" w:w="3175"/>
+            <w:shd w:fill="D9D9D9"/>
+          </w:tcPr>
+          <w:p>
+            <w:pPr>
+              <w:spacing w:after="0"/>
+              <w:jc w:val="center"/>
+            </w:pPr>
+            <w:r/>
+            <w:r>
+              <w:rPr>
+                <w:rFonts w:ascii="Times New Roman" w:hAnsi="Times New Roman"/>
+                <w:b/>
+                <w:sz w:val="20"/>
+              </w:rPr>
+              <w:t xml:space="preserve">Tabla</w:t>
+            </w:r>
+          </w:p>
+        </w:tc>
+        <w:tc>
+          <w:tcPr>
+            <w:tcW w:type="dxa" w:w="1247"/>
+            <w:shd w:fill="D9D9D9"/>
+          </w:tcPr>
+          <w:p>
+            <w:pPr>
+              <w:spacing w:after="0"/>
+              <w:jc w:val="center"/>
+            </w:pPr>
+            <w:r/>
+            <w:r>
+              <w:rPr>
+                <w:rFonts w:ascii="Times New Roman" w:hAnsi="Times New Roman"/>
+                <w:b/>
+                <w:sz w:val="20"/>
+              </w:rPr>
+              <w:t xml:space="preserve">Registros (23-09 → 25-09)</w:t>
+            </w:r>
+          </w:p>
+        </w:tc>
+        <w:tc>
+          <w:tcPr>
+            <w:tcW w:type="dxa" w:w="4649"/>
+            <w:shd w:fill="D9D9D9"/>
+          </w:tcPr>
+          <w:p>
+            <w:pPr>
+              <w:spacing w:after="0"/>
+              <w:jc w:val="center"/>
+            </w:pPr>
+            <w:r/>
+            <w:r>
+              <w:rPr>
+                <w:rFonts w:ascii="Times New Roman" w:hAnsi="Times New Roman"/>
+                <w:b/>
+                <w:sz w:val="20"/>
+              </w:rPr>
+              <w:t xml:space="preserve">Contenido agregado</w:t>
+            </w:r>
+          </w:p>
+        </w:tc>
+      </w:tr>
+      <w:tr>
+        <w:tc>
+          <w:tcPr>
+            <w:tcW w:type="dxa" w:w="3175"/>
+          </w:tcPr>
+          <w:p>
+            <w:pPr>
+              <w:spacing w:after="0"/>
+            </w:pPr>
+            <w:r/>
+            <w:r>
+              <w:rPr>
+                <w:rFonts w:ascii="Times New Roman" w:hAnsi="Times New Roman"/>
+                <w:sz w:val="20"/>
+              </w:rPr>
+              <w:t xml:space="preserve">roles</w:t>
+            </w:r>
+          </w:p>
+        </w:tc>
+        <w:tc>
+          <w:tcPr>
+            <w:tcW w:type="dxa" w:w="1247"/>
+          </w:tcPr>
+          <w:p>
+            <w:pPr>
+              <w:spacing w:after="0"/>
+            </w:pPr>
+            <w:r/>
+            <w:r>
+              <w:rPr>
+                <w:rFonts w:ascii="Times New Roman" w:hAnsi="Times New Roman"/>
+                <w:sz w:val="20"/>
+              </w:rPr>
+              <w:t xml:space="preserve">3 → 10</w:t>
+            </w:r>
+          </w:p>
+        </w:tc>
+        <w:tc>
+          <w:tcPr>
+            <w:tcW w:type="dxa" w:w="4649"/>
+          </w:tcPr>
+          <w:p>
+            <w:pPr>
+              <w:spacing w:after="0"/>
+            </w:pPr>
+            <w:r/>
+            <w:r>
+              <w:rPr>
+                <w:rFonts w:ascii="Times New Roman" w:hAnsi="Times New Roman"/>
+                <w:sz w:val="20"/>
+              </w:rPr>
+              <w:t xml:space="preserve">supervisor, bodeguero, contador, auxiliar, gerente, soporte, auditor</w:t>
+            </w:r>
+          </w:p>
+        </w:tc>
+      </w:tr>
+      <w:tr>
+        <w:tc>
+          <w:tcPr>
+            <w:tcW w:type="dxa" w:w="3175"/>
+          </w:tcPr>
+          <w:p>
+            <w:pPr>
+              <w:spacing w:after="0"/>
+            </w:pPr>
+            <w:r/>
+            <w:r>
+              <w:rPr>
+                <w:rFonts w:ascii="Times New Roman" w:hAnsi="Times New Roman"/>
+                <w:sz w:val="20"/>
+              </w:rPr>
+              <w:t xml:space="preserve">usuarios</w:t>
+            </w:r>
+          </w:p>
+        </w:tc>
+        <w:tc>
+          <w:tcPr>
+            <w:tcW w:type="dxa" w:w="1247"/>
+          </w:tcPr>
+          <w:p>
+            <w:pPr>
+              <w:spacing w:after="0"/>
+            </w:pPr>
+            <w:r/>
+            <w:r>
+              <w:rPr>
+                <w:rFonts w:ascii="Times New Roman" w:hAnsi="Times New Roman"/>
+                <w:sz w:val="20"/>
+              </w:rPr>
+              <w:t xml:space="preserve">3 → 10</w:t>
+            </w:r>
+          </w:p>
+        </w:tc>
+        <w:tc>
+          <w:tcPr>
+            <w:tcW w:type="dxa" w:w="4649"/>
+          </w:tcPr>
+          <w:p>
+            <w:pPr>
+              <w:spacing w:after="0"/>
+            </w:pPr>
+            <w:r/>
+            <w:r>
+              <w:rPr>
+                <w:rFonts w:ascii="Times New Roman" w:hAnsi="Times New Roman"/>
+                <w:sz w:val="20"/>
+              </w:rPr>
+              <w:t xml:space="preserve">2 cajeros (1 inactivo), 2 domiciliarios, supervisora, bodeguero, contadora</w:t>
+            </w:r>
+          </w:p>
+        </w:tc>
+      </w:tr>
+      <w:tr>
+        <w:tc>
+          <w:tcPr>
+            <w:tcW w:type="dxa" w:w="3175"/>
+          </w:tcPr>
+          <w:p>
+            <w:pPr>
+              <w:spacing w:after="0"/>
+            </w:pPr>
+            <w:r/>
+            <w:r>
+              <w:rPr>
+                <w:rFonts w:ascii="Times New Roman" w:hAnsi="Times New Roman"/>
+                <w:sz w:val="20"/>
+              </w:rPr>
+              <w:t xml:space="preserve">categorias</w:t>
+            </w:r>
+          </w:p>
+        </w:tc>
+        <w:tc>
+          <w:tcPr>
+            <w:tcW w:type="dxa" w:w="1247"/>
+          </w:tcPr>
+          <w:p>
+            <w:pPr>
+              <w:spacing w:after="0"/>
+            </w:pPr>
+            <w:r/>
+            <w:r>
+              <w:rPr>
+                <w:rFonts w:ascii="Times New Roman" w:hAnsi="Times New Roman"/>
+                <w:sz w:val="20"/>
+              </w:rPr>
+              <w:t xml:space="preserve">5 → 10</w:t>
+            </w:r>
+          </w:p>
+        </w:tc>
+        <w:tc>
+          <w:tcPr>
+            <w:tcW w:type="dxa" w:w="4649"/>
+          </w:tcPr>
+          <w:p>
+            <w:pPr>
+              <w:spacing w:after="0"/>
+            </w:pPr>
+            <w:r/>
+            <w:r>
+              <w:rPr>
+                <w:rFonts w:ascii="Times New Roman" w:hAnsi="Times New Roman"/>
+                <w:sz w:val="20"/>
+              </w:rPr>
+              <w:t xml:space="preserve">Carnes, Frutas y verduras, Snacks, Enlatados, Mascotas</w:t>
+            </w:r>
+          </w:p>
+        </w:tc>
+      </w:tr>
+      <w:tr>
+        <w:tc>
+          <w:tcPr>
+            <w:tcW w:type="dxa" w:w="3175"/>
+          </w:tcPr>
+          <w:p>
+            <w:pPr>
+              <w:spacing w:after="0"/>
+            </w:pPr>
+            <w:r/>
+            <w:r>
+              <w:rPr>
+                <w:rFonts w:ascii="Times New Roman" w:hAnsi="Times New Roman"/>
+                <w:sz w:val="20"/>
+              </w:rPr>
+              <w:t xml:space="preserve">productos</w:t>
+            </w:r>
+          </w:p>
+        </w:tc>
+        <w:tc>
+          <w:tcPr>
+            <w:tcW w:type="dxa" w:w="1247"/>
+          </w:tcPr>
+          <w:p>
+            <w:pPr>
+              <w:spacing w:after="0"/>
+            </w:pPr>
+            <w:r/>
+            <w:r>
+              <w:rPr>
+                <w:rFonts w:ascii="Times New Roman" w:hAnsi="Times New Roman"/>
+                <w:sz w:val="20"/>
+              </w:rPr>
+              <w:t xml:space="preserve">5 → 10</w:t>
+            </w:r>
+          </w:p>
+        </w:tc>
+        <w:tc>
+          <w:tcPr>
+            <w:tcW w:type="dxa" w:w="4649"/>
+          </w:tcPr>
+          <w:p>
+            <w:pPr>
+              <w:spacing w:after="0"/>
+            </w:pPr>
+            <w:r/>
+            <w:r>
+              <w:rPr>
+                <w:rFonts w:ascii="Times New Roman" w:hAnsi="Times New Roman"/>
+                <w:sz w:val="20"/>
+              </w:rPr>
+              <w:t xml:space="preserve">Aceite, jabón, gaseosa, salchichas, atún</w:t>
+            </w:r>
+          </w:p>
+        </w:tc>
+      </w:tr>
+      <w:tr>
+        <w:tc>
+          <w:tcPr>
+            <w:tcW w:type="dxa" w:w="3175"/>
+          </w:tcPr>
+          <w:p>
+            <w:pPr>
+              <w:spacing w:after="0"/>
+            </w:pPr>
+            <w:r/>
+            <w:r>
+              <w:rPr>
+                <w:rFonts w:ascii="Times New Roman" w:hAnsi="Times New Roman"/>
+                <w:sz w:val="20"/>
+              </w:rPr>
+              <w:t xml:space="preserve">metodos_pago</w:t>
+            </w:r>
+          </w:p>
+        </w:tc>
+        <w:tc>
+          <w:tcPr>
+            <w:tcW w:type="dxa" w:w="1247"/>
+          </w:tcPr>
+          <w:p>
+            <w:pPr>
+              <w:spacing w:after="0"/>
+            </w:pPr>
+            <w:r/>
+            <w:r>
+              <w:rPr>
+                <w:rFonts w:ascii="Times New Roman" w:hAnsi="Times New Roman"/>
+                <w:sz w:val="20"/>
+              </w:rPr>
+              <w:t xml:space="preserve">4 → 10</w:t>
+            </w:r>
+          </w:p>
+        </w:tc>
+        <w:tc>
+          <w:tcPr>
+            <w:tcW w:type="dxa" w:w="4649"/>
+          </w:tcPr>
+          <w:p>
+            <w:pPr>
+              <w:spacing w:after="0"/>
+            </w:pPr>
+            <w:r/>
+            <w:r>
+              <w:rPr>
+                <w:rFonts w:ascii="Times New Roman" w:hAnsi="Times New Roman"/>
+                <w:sz w:val="20"/>
+              </w:rPr>
+              <w:t xml:space="preserve">Daviplata, QR Bancolombia, PSE, crédito, bono; Movii inactivo</w:t>
+            </w:r>
+          </w:p>
+        </w:tc>
+      </w:tr>
+      <w:tr>
+        <w:tc>
+          <w:tcPr>
+            <w:tcW w:type="dxa" w:w="3175"/>
+          </w:tcPr>
+          <w:p>
+            <w:pPr>
+              <w:spacing w:after="0"/>
+            </w:pPr>
+            <w:r/>
+            <w:r>
+              <w:rPr>
+                <w:rFonts w:ascii="Times New Roman" w:hAnsi="Times New Roman"/>
+                <w:sz w:val="20"/>
+              </w:rPr>
+              <w:t xml:space="preserve">clientes</w:t>
+            </w:r>
+          </w:p>
+        </w:tc>
+        <w:tc>
+          <w:tcPr>
+            <w:tcW w:type="dxa" w:w="1247"/>
+          </w:tcPr>
+          <w:p>
+            <w:pPr>
+              <w:spacing w:after="0"/>
+            </w:pPr>
+            <w:r/>
+            <w:r>
+              <w:rPr>
+                <w:rFonts w:ascii="Times New Roman" w:hAnsi="Times New Roman"/>
+                <w:sz w:val="20"/>
+              </w:rPr>
+              <w:t xml:space="preserve">2 → 10</w:t>
+            </w:r>
+          </w:p>
+        </w:tc>
+        <w:tc>
+          <w:tcPr>
+            <w:tcW w:type="dxa" w:w="4649"/>
+          </w:tcPr>
+          <w:p>
+            <w:pPr>
+              <w:spacing w:after="0"/>
+            </w:pPr>
+            <w:r/>
+            <w:r>
+              <w:rPr>
+                <w:rFonts w:ascii="Times New Roman" w:hAnsi="Times New Roman"/>
+                <w:sz w:val="20"/>
+              </w:rPr>
+              <w:t xml:space="preserve">Ocho clientes con teléfono único</w:t>
+            </w:r>
+          </w:p>
+        </w:tc>
+      </w:tr>
+      <w:tr>
+        <w:tc>
+          <w:tcPr>
+            <w:tcW w:type="dxa" w:w="3175"/>
+          </w:tcPr>
+          <w:p>
+            <w:pPr>
+              <w:spacing w:after="0"/>
+            </w:pPr>
+            <w:r/>
+            <w:r>
+              <w:rPr>
+                <w:rFonts w:ascii="Times New Roman" w:hAnsi="Times New Roman"/>
+                <w:sz w:val="20"/>
+              </w:rPr>
+              <w:t xml:space="preserve">arqueo_caja</w:t>
+            </w:r>
+          </w:p>
+        </w:tc>
+        <w:tc>
+          <w:tcPr>
+            <w:tcW w:type="dxa" w:w="1247"/>
+          </w:tcPr>
+          <w:p>
+            <w:pPr>
+              <w:spacing w:after="0"/>
+            </w:pPr>
+            <w:r/>
+            <w:r>
+              <w:rPr>
+                <w:rFonts w:ascii="Times New Roman" w:hAnsi="Times New Roman"/>
+                <w:sz w:val="20"/>
+              </w:rPr>
+              <w:t xml:space="preserve">1 → 10</w:t>
+            </w:r>
+          </w:p>
+        </w:tc>
+        <w:tc>
+          <w:tcPr>
+            <w:tcW w:type="dxa" w:w="4649"/>
+          </w:tcPr>
+          <w:p>
+            <w:pPr>
+              <w:spacing w:after="0"/>
+            </w:pPr>
+            <w:r/>
+            <w:r>
+              <w:rPr>
+                <w:rFonts w:ascii="Times New Roman" w:hAnsi="Times New Roman"/>
+                <w:sz w:val="20"/>
+              </w:rPr>
+              <w:t xml:space="preserve">Ocho turnos cerrados (uno con sobrante y otro con faltante) y uno abierto</w:t>
+            </w:r>
+          </w:p>
+        </w:tc>
+      </w:tr>
+      <w:tr>
+        <w:tc>
+          <w:tcPr>
+            <w:tcW w:type="dxa" w:w="3175"/>
+          </w:tcPr>
+          <w:p>
+            <w:pPr>
+              <w:spacing w:after="0"/>
+            </w:pPr>
+            <w:r/>
+            <w:r>
+              <w:rPr>
+                <w:rFonts w:ascii="Times New Roman" w:hAnsi="Times New Roman"/>
+                <w:sz w:val="20"/>
+              </w:rPr>
+              <w:t xml:space="preserve">ventas</w:t>
+            </w:r>
+          </w:p>
+        </w:tc>
+        <w:tc>
+          <w:tcPr>
+            <w:tcW w:type="dxa" w:w="1247"/>
+          </w:tcPr>
+          <w:p>
+            <w:pPr>
+              <w:spacing w:after="0"/>
+            </w:pPr>
+            <w:r/>
+            <w:r>
+              <w:rPr>
+                <w:rFonts w:ascii="Times New Roman" w:hAnsi="Times New Roman"/>
+                <w:sz w:val="20"/>
+              </w:rPr>
+              <w:t xml:space="preserve">3 → 12</w:t>
+            </w:r>
+          </w:p>
+        </w:tc>
+        <w:tc>
+          <w:tcPr>
+            <w:tcW w:type="dxa" w:w="4649"/>
+          </w:tcPr>
+          <w:p>
+            <w:pPr>
+              <w:spacing w:after="0"/>
+            </w:pPr>
+            <w:r/>
+            <w:r>
+              <w:rPr>
+                <w:rFonts w:ascii="Times New Roman" w:hAnsi="Times New Roman"/>
+                <w:sz w:val="20"/>
+              </w:rPr>
+              <w:t xml:space="preserve">Nueve ventas; la 7 anulada por devolución</w:t>
+            </w:r>
+          </w:p>
+        </w:tc>
+      </w:tr>
+      <w:tr>
+        <w:tc>
+          <w:tcPr>
+            <w:tcW w:type="dxa" w:w="3175"/>
+          </w:tcPr>
+          <w:p>
+            <w:pPr>
+              <w:spacing w:after="0"/>
+            </w:pPr>
+            <w:r/>
+            <w:r>
+              <w:rPr>
+                <w:rFonts w:ascii="Times New Roman" w:hAnsi="Times New Roman"/>
+                <w:sz w:val="20"/>
+              </w:rPr>
+              <w:t xml:space="preserve">detalle_venta</w:t>
+            </w:r>
+          </w:p>
+        </w:tc>
+        <w:tc>
+          <w:tcPr>
+            <w:tcW w:type="dxa" w:w="1247"/>
+          </w:tcPr>
+          <w:p>
+            <w:pPr>
+              <w:spacing w:after="0"/>
+            </w:pPr>
+            <w:r/>
+            <w:r>
+              <w:rPr>
+                <w:rFonts w:ascii="Times New Roman" w:hAnsi="Times New Roman"/>
+                <w:sz w:val="20"/>
+              </w:rPr>
+              <w:t xml:space="preserve">6 → 20</w:t>
+            </w:r>
+          </w:p>
+        </w:tc>
+        <w:tc>
+          <w:tcPr>
+            <w:tcW w:type="dxa" w:w="4649"/>
+          </w:tcPr>
+          <w:p>
+            <w:pPr>
+              <w:spacing w:after="0"/>
+            </w:pPr>
+            <w:r/>
+            <w:r>
+              <w:rPr>
+                <w:rFonts w:ascii="Times New Roman" w:hAnsi="Times New Roman"/>
+                <w:sz w:val="20"/>
+              </w:rPr>
+              <w:t xml:space="preserve">Al menos un renglón por venta</w:t>
+            </w:r>
+          </w:p>
+        </w:tc>
+      </w:tr>
+      <w:tr>
+        <w:tc>
+          <w:tcPr>
+            <w:tcW w:type="dxa" w:w="3175"/>
+          </w:tcPr>
+          <w:p>
+            <w:pPr>
+              <w:spacing w:after="0"/>
+            </w:pPr>
+            <w:r/>
+            <w:r>
+              <w:rPr>
+                <w:rFonts w:ascii="Times New Roman" w:hAnsi="Times New Roman"/>
+                <w:sz w:val="20"/>
+              </w:rPr>
+              <w:t xml:space="preserve">domicilios</w:t>
+            </w:r>
+          </w:p>
+        </w:tc>
+        <w:tc>
+          <w:tcPr>
+            <w:tcW w:type="dxa" w:w="1247"/>
+          </w:tcPr>
+          <w:p>
+            <w:pPr>
+              <w:spacing w:after="0"/>
+            </w:pPr>
+            <w:r/>
+            <w:r>
+              <w:rPr>
+                <w:rFonts w:ascii="Times New Roman" w:hAnsi="Times New Roman"/>
+                <w:sz w:val="20"/>
+              </w:rPr>
+              <w:t xml:space="preserve">1 → 10</w:t>
+            </w:r>
+          </w:p>
+        </w:tc>
+        <w:tc>
+          <w:tcPr>
+            <w:tcW w:type="dxa" w:w="4649"/>
+          </w:tcPr>
+          <w:p>
+            <w:pPr>
+              <w:spacing w:after="0"/>
+            </w:pPr>
+            <w:r/>
+            <w:r>
+              <w:rPr>
+                <w:rFonts w:ascii="Times New Roman" w:hAnsi="Times New Roman"/>
+                <w:sz w:val="20"/>
+              </w:rPr>
+              <w:t xml:space="preserve">Entregados, uno cancelado y uno asignado</w:t>
+            </w:r>
+          </w:p>
+        </w:tc>
+      </w:tr>
+      <w:tr>
+        <w:tc>
+          <w:tcPr>
+            <w:tcW w:type="dxa" w:w="3175"/>
+          </w:tcPr>
+          <w:p>
+            <w:pPr>
+              <w:spacing w:after="0"/>
+            </w:pPr>
+            <w:r/>
+            <w:r>
+              <w:rPr>
+                <w:rFonts w:ascii="Times New Roman" w:hAnsi="Times New Roman"/>
+                <w:sz w:val="20"/>
+              </w:rPr>
+              <w:t xml:space="preserve">movimientos_inventario</w:t>
+            </w:r>
+          </w:p>
+        </w:tc>
+        <w:tc>
+          <w:tcPr>
+            <w:tcW w:type="dxa" w:w="1247"/>
+          </w:tcPr>
+          <w:p>
+            <w:pPr>
+              <w:spacing w:after="0"/>
+            </w:pPr>
+            <w:r/>
+            <w:r>
+              <w:rPr>
+                <w:rFonts w:ascii="Times New Roman" w:hAnsi="Times New Roman"/>
+                <w:sz w:val="20"/>
+              </w:rPr>
+              <w:t xml:space="preserve">5 → 26</w:t>
+            </w:r>
+          </w:p>
+        </w:tc>
+        <w:tc>
+          <w:tcPr>
+            <w:tcW w:type="dxa" w:w="4649"/>
+          </w:tcPr>
+          <w:p>
+            <w:pPr>
+              <w:spacing w:after="0"/>
+            </w:pPr>
+            <w:r/>
+            <w:r>
+              <w:rPr>
+                <w:rFonts w:ascii="Times New Roman" w:hAnsi="Times New Roman"/>
+                <w:sz w:val="20"/>
+              </w:rPr>
+              <w:t xml:space="preserve">Entradas, una salida por renglón, un reverso y una merma</w:t>
+            </w:r>
+          </w:p>
+        </w:tc>
+      </w:tr>
+      <w:tr>
+        <w:tc>
+          <w:tcPr>
+            <w:tcW w:type="dxa" w:w="3175"/>
+          </w:tcPr>
+          <w:p>
+            <w:pPr>
+              <w:spacing w:after="0"/>
+            </w:pPr>
+            <w:r/>
+            <w:r>
+              <w:rPr>
+                <w:rFonts w:ascii="Times New Roman" w:hAnsi="Times New Roman"/>
+                <w:sz w:val="20"/>
+              </w:rPr>
+              <w:t xml:space="preserve">log_auditoria</w:t>
+            </w:r>
+          </w:p>
+        </w:tc>
+        <w:tc>
+          <w:tcPr>
+            <w:tcW w:type="dxa" w:w="1247"/>
+          </w:tcPr>
+          <w:p>
+            <w:pPr>
+              <w:spacing w:after="0"/>
+            </w:pPr>
+            <w:r/>
+            <w:r>
+              <w:rPr>
+                <w:rFonts w:ascii="Times New Roman" w:hAnsi="Times New Roman"/>
+                <w:sz w:val="20"/>
+              </w:rPr>
+              <w:t xml:space="preserve">5 → 10</w:t>
+            </w:r>
+          </w:p>
+        </w:tc>
+        <w:tc>
+          <w:tcPr>
+            <w:tcW w:type="dxa" w:w="4649"/>
+          </w:tcPr>
+          <w:p>
+            <w:pPr>
+              <w:spacing w:after="0"/>
+            </w:pPr>
+            <w:r/>
+            <w:r>
+              <w:rPr>
+                <w:rFonts w:ascii="Times New Roman" w:hAnsi="Times New Roman"/>
+                <w:sz w:val="20"/>
+              </w:rPr>
+              <w:t xml:space="preserve">Registro de usuario, anulación, cierre y un login fallido</w:t>
+            </w:r>
+          </w:p>
+        </w:tc>
+      </w:tr>
+      <w:tr>
+        <w:tc>
+          <w:tcPr>
+            <w:tcW w:type="dxa" w:w="3175"/>
+          </w:tcPr>
+          <w:p>
+            <w:pPr>
+              <w:spacing w:after="0"/>
+            </w:pPr>
+            <w:r/>
+            <w:r>
+              <w:rPr>
+                <w:rFonts w:ascii="Times New Roman" w:hAnsi="Times New Roman"/>
+                <w:sz w:val="20"/>
+              </w:rPr>
+              <w:t xml:space="preserve">sesiones_chatbot</w:t>
+            </w:r>
+          </w:p>
+        </w:tc>
+        <w:tc>
+          <w:tcPr>
+            <w:tcW w:type="dxa" w:w="1247"/>
+          </w:tcPr>
+          <w:p>
+            <w:pPr>
+              <w:spacing w:after="0"/>
+            </w:pPr>
+            <w:r/>
+            <w:r>
+              <w:rPr>
+                <w:rFonts w:ascii="Times New Roman" w:hAnsi="Times New Roman"/>
+                <w:sz w:val="20"/>
+              </w:rPr>
+              <w:t xml:space="preserve">1 → 10</w:t>
+            </w:r>
+          </w:p>
+        </w:tc>
+        <w:tc>
+          <w:tcPr>
+            <w:tcW w:type="dxa" w:w="4649"/>
+          </w:tcPr>
+          <w:p>
+            <w:pPr>
+              <w:spacing w:after="0"/>
+            </w:pPr>
+            <w:r/>
+            <w:r>
+              <w:rPr>
+                <w:rFonts w:ascii="Times New Roman" w:hAnsi="Times New Roman"/>
+                <w:sz w:val="20"/>
+              </w:rPr>
+              <w:t xml:space="preserve">Conversaciones en distintos pasos del flujo</w:t>
+            </w:r>
+          </w:p>
+        </w:tc>
+      </w:tr>
+      <w:tr>
+        <w:tc>
+          <w:tcPr>
+            <w:tcW w:type="dxa" w:w="3175"/>
+          </w:tcPr>
+          <w:p>
+            <w:pPr>
+              <w:spacing w:after="0"/>
+            </w:pPr>
+            <w:r/>
+            <w:r>
+              <w:rPr>
+                <w:rFonts w:ascii="Times New Roman" w:hAnsi="Times New Roman"/>
+                <w:sz w:val="20"/>
+              </w:rPr>
+              <w:t xml:space="preserve">carrito_chatbot</w:t>
+            </w:r>
+          </w:p>
+        </w:tc>
+        <w:tc>
+          <w:tcPr>
+            <w:tcW w:type="dxa" w:w="1247"/>
+          </w:tcPr>
+          <w:p>
+            <w:pPr>
+              <w:spacing w:after="0"/>
+            </w:pPr>
+            <w:r/>
+            <w:r>
+              <w:rPr>
+                <w:rFonts w:ascii="Times New Roman" w:hAnsi="Times New Roman"/>
+                <w:sz w:val="20"/>
+              </w:rPr>
+              <w:t xml:space="preserve">2 → 10</w:t>
+            </w:r>
+          </w:p>
+        </w:tc>
+        <w:tc>
+          <w:tcPr>
+            <w:tcW w:type="dxa" w:w="4649"/>
+          </w:tcPr>
+          <w:p>
+            <w:pPr>
+              <w:spacing w:after="0"/>
+            </w:pPr>
+            <w:r/>
+            <w:r>
+              <w:rPr>
+                <w:rFonts w:ascii="Times New Roman" w:hAnsi="Times New Roman"/>
+                <w:sz w:val="20"/>
+              </w:rPr>
+              <w:t xml:space="preserve">Productos en seis conversaciones</w:t>
+            </w:r>
+          </w:p>
+        </w:tc>
+      </w:tr>
+    </w:tbl>
+    <w:p>
+      <w:pPr>
+        <w:spacing w:before="60" w:after="240"/>
+        <w:jc w:val="both"/>
+      </w:pPr>
+      <w:r>
+        <w:rPr>
+          <w:rFonts w:ascii="Times New Roman" w:hAnsi="Times New Roman"/>
+          <w:i/>
+          <w:sz w:val="20"/>
+        </w:rPr>
+        <w:t xml:space="preserve">Nota. </w:t>
+      </w:r>
+      <w:r>
+        <w:rPr>
+          <w:rFonts w:ascii="Times New Roman" w:hAnsi="Times New Roman"/>
+          <w:sz w:val="20"/>
+        </w:rPr>
+        <w:t xml:space="preserve"> Elaboración propia. Conteos obtenidos con la consulta de verificación V1 del script.</w:t>
+      </w:r>
+    </w:p>
+    <w:p>
+      <w:pPr>
+        <w:spacing w:line="240" w:lineRule="auto" w:before="0" w:after="200"/>
+        <w:ind w:firstLine="720"/>
+        <w:jc w:val="both"/>
+      </w:pPr>
+      <w:r>
+        <w:rPr>
+          <w:rFonts w:ascii="Times New Roman" w:hAnsi="Times New Roman"/>
+          <w:b w:val="0"/>
+          <w:i w:val="0"/>
+          <w:sz w:val="24"/>
+        </w:rPr>
+        <w:t xml:space="preserve">La base de controlstore_sena no se modificó. El script se probó en una instancia temporal de MySQL 8.4.9 creada a partir del volcado controlstore_codigo.sql, que se eliminó al terminar. La Tabla 8 recoge los resultados de esa prueba.</w:t>
+      </w:r>
+    </w:p>
+    <w:p>
+      <w:pPr>
+        <w:spacing w:before="200" w:after="0"/>
+      </w:pPr>
+      <w:r>
+        <w:rPr>
+          <w:rFonts w:ascii="Times New Roman" w:hAnsi="Times New Roman"/>
+          <w:b/>
+          <w:sz w:val="24"/>
+        </w:rPr>
+        <w:t xml:space="preserve">Tabla 8</w:t>
+      </w:r>
+    </w:p>
+    <w:p>
+      <w:pPr>
+        <w:spacing w:after="80"/>
+      </w:pPr>
+      <w:r>
+        <w:rPr>
+          <w:rFonts w:ascii="Times New Roman" w:hAnsi="Times New Roman"/>
+          <w:i/>
+          <w:sz w:val="24"/>
+        </w:rPr>
+        <w:t xml:space="preserve">Pruebas del script 03_datos_diez_por_tabla.sql</w:t>
+      </w:r>
+    </w:p>
+    <w:tbl>
+      <w:tblPr>
+        <w:tblStyle w:val="TableGrid"/>
+        <w:tblW w:type="auto" w:w="0"/>
+        <w:jc w:val="center"/>
+        <w:tblLook w:firstColumn="1" w:firstRow="1" w:lastColumn="0" w:lastRow="0" w:noHBand="0" w:noVBand="1" w:val="04A0"/>
+      </w:tblPr>
+      <w:tblGrid>
+        <w:gridCol w:w="2340"/>
+        <w:gridCol w:w="2340"/>
+        <w:gridCol w:w="2340"/>
+        <w:gridCol w:w="2340"/>
+      </w:tblGrid>
+      <w:tr>
+        <w:tc>
+          <w:tcPr>
+            <w:tcW w:type="dxa" w:w="624"/>
+            <w:shd w:fill="D9D9D9"/>
+          </w:tcPr>
+          <w:p>
+            <w:pPr>
+              <w:spacing w:after="0"/>
+              <w:jc w:val="center"/>
+            </w:pPr>
+            <w:r/>
+            <w:r>
+              <w:rPr>
+                <w:rFonts w:ascii="Times New Roman" w:hAnsi="Times New Roman"/>
+                <w:b/>
+                <w:sz w:val="18"/>
+              </w:rPr>
+              <w:t xml:space="preserve">N.°</w:t>
+            </w:r>
+          </w:p>
+        </w:tc>
+        <w:tc>
+          <w:tcPr>
+            <w:tcW w:type="dxa" w:w="3742"/>
+            <w:shd w:fill="D9D9D9"/>
+          </w:tcPr>
+          <w:p>
+            <w:pPr>
+              <w:spacing w:after="0"/>
+              <w:jc w:val="center"/>
+            </w:pPr>
+            <w:r/>
+            <w:r>
+              <w:rPr>
+                <w:rFonts w:ascii="Times New Roman" w:hAnsi="Times New Roman"/>
+                <w:b/>
+                <w:sz w:val="18"/>
+              </w:rPr>
+              <w:t xml:space="preserve">Prueba ejecutada</w:t>
+            </w:r>
+          </w:p>
+        </w:tc>
+        <w:tc>
+          <w:tcPr>
+            <w:tcW w:type="dxa" w:w="3005"/>
+            <w:shd w:fill="D9D9D9"/>
+          </w:tcPr>
+          <w:p>
+            <w:pPr>
+              <w:spacing w:after="0"/>
+              <w:jc w:val="center"/>
+            </w:pPr>
+            <w:r/>
+            <w:r>
+              <w:rPr>
+                <w:rFonts w:ascii="Times New Roman" w:hAnsi="Times New Roman"/>
+                <w:b/>
+                <w:sz w:val="18"/>
+              </w:rPr>
+              <w:t xml:space="preserve">Resultado esperado</w:t>
+            </w:r>
+          </w:p>
+        </w:tc>
+        <w:tc>
+          <w:tcPr>
+            <w:tcW w:type="dxa" w:w="1701"/>
+            <w:shd w:fill="D9D9D9"/>
+          </w:tcPr>
+          <w:p>
+            <w:pPr>
+              <w:spacing w:after="0"/>
+              <w:jc w:val="center"/>
+            </w:pPr>
+            <w:r/>
+            <w:r>
+              <w:rPr>
+                <w:rFonts w:ascii="Times New Roman" w:hAnsi="Times New Roman"/>
+                <w:b/>
+                <w:sz w:val="18"/>
+              </w:rPr>
+              <w:t xml:space="preserve">Obtenido</w:t>
+            </w:r>
+          </w:p>
+        </w:tc>
+      </w:tr>
+      <w:tr>
+        <w:tc>
+          <w:tcPr>
+            <w:tcW w:type="dxa" w:w="624"/>
+          </w:tcPr>
+          <w:p>
+            <w:pPr>
+              <w:spacing w:after="0"/>
+            </w:pPr>
+            <w:r/>
+            <w:r>
+              <w:rPr>
+                <w:rFonts w:ascii="Times New Roman" w:hAnsi="Times New Roman"/>
+                <w:sz w:val="18"/>
+              </w:rPr>
+              <w:t xml:space="preserve">1</w:t>
+            </w:r>
+          </w:p>
+        </w:tc>
+        <w:tc>
+          <w:tcPr>
+            <w:tcW w:type="dxa" w:w="3742"/>
+          </w:tcPr>
+          <w:p>
+            <w:pPr>
+              <w:spacing w:after="0"/>
+            </w:pPr>
+            <w:r/>
+            <w:r>
+              <w:rPr>
+                <w:rFonts w:ascii="Times New Roman" w:hAnsi="Times New Roman"/>
+                <w:sz w:val="18"/>
+              </w:rPr>
+              <w:t xml:space="preserve">Conteo de filas de las 14 tablas</w:t>
+            </w:r>
+          </w:p>
+        </w:tc>
+        <w:tc>
+          <w:tcPr>
+            <w:tcW w:type="dxa" w:w="3005"/>
+          </w:tcPr>
+          <w:p>
+            <w:pPr>
+              <w:spacing w:after="0"/>
+            </w:pPr>
+            <w:r/>
+            <w:r>
+              <w:rPr>
+                <w:rFonts w:ascii="Times New Roman" w:hAnsi="Times New Roman"/>
+                <w:sz w:val="18"/>
+              </w:rPr>
+              <w:t xml:space="preserve">Ninguna con menos de 10</w:t>
+            </w:r>
+          </w:p>
+        </w:tc>
+        <w:tc>
+          <w:tcPr>
+            <w:tcW w:type="dxa" w:w="1701"/>
+          </w:tcPr>
+          <w:p>
+            <w:pPr>
+              <w:spacing w:after="0"/>
+            </w:pPr>
+            <w:r/>
+            <w:r>
+              <w:rPr>
+                <w:rFonts w:ascii="Times New Roman" w:hAnsi="Times New Roman"/>
+                <w:sz w:val="18"/>
+              </w:rPr>
+              <w:t xml:space="preserve">Cumple: 10 en once tablas; 12, 20 y 26 en las otras tres</w:t>
+            </w:r>
+          </w:p>
+        </w:tc>
+      </w:tr>
+      <w:tr>
+        <w:tc>
+          <w:tcPr>
+            <w:tcW w:type="dxa" w:w="624"/>
+          </w:tcPr>
+          <w:p>
+            <w:pPr>
+              <w:spacing w:after="0"/>
+            </w:pPr>
+            <w:r/>
+            <w:r>
+              <w:rPr>
+                <w:rFonts w:ascii="Times New Roman" w:hAnsi="Times New Roman"/>
+                <w:sz w:val="18"/>
+              </w:rPr>
+              <w:t xml:space="preserve">2</w:t>
+            </w:r>
+          </w:p>
+        </w:tc>
+        <w:tc>
+          <w:tcPr>
+            <w:tcW w:type="dxa" w:w="3742"/>
+          </w:tcPr>
+          <w:p>
+            <w:pPr>
+              <w:spacing w:after="0"/>
+            </w:pPr>
+            <w:r/>
+            <w:r>
+              <w:rPr>
+                <w:rFonts w:ascii="Times New Roman" w:hAnsi="Times New Roman"/>
+                <w:sz w:val="18"/>
+              </w:rPr>
+              <w:t xml:space="preserve">Ventas cuya cabecera no suma sus renglones</w:t>
+            </w:r>
+          </w:p>
+        </w:tc>
+        <w:tc>
+          <w:tcPr>
+            <w:tcW w:type="dxa" w:w="3005"/>
+          </w:tcPr>
+          <w:p>
+            <w:pPr>
+              <w:spacing w:after="0"/>
+            </w:pPr>
+            <w:r/>
+            <w:r>
+              <w:rPr>
+                <w:rFonts w:ascii="Times New Roman" w:hAnsi="Times New Roman"/>
+                <w:sz w:val="18"/>
+              </w:rPr>
+              <w:t xml:space="preserve">0 filas</w:t>
+            </w:r>
+          </w:p>
+        </w:tc>
+        <w:tc>
+          <w:tcPr>
+            <w:tcW w:type="dxa" w:w="1701"/>
+          </w:tcPr>
+          <w:p>
+            <w:pPr>
+              <w:spacing w:after="0"/>
+            </w:pPr>
+            <w:r/>
+            <w:r>
+              <w:rPr>
+                <w:rFonts w:ascii="Times New Roman" w:hAnsi="Times New Roman"/>
+                <w:sz w:val="18"/>
+              </w:rPr>
+              <w:t xml:space="preserve">0 filas: los disparadores calcularon los 12 totales</w:t>
+            </w:r>
+          </w:p>
+        </w:tc>
+      </w:tr>
+      <w:tr>
+        <w:tc>
+          <w:tcPr>
+            <w:tcW w:type="dxa" w:w="624"/>
+          </w:tcPr>
+          <w:p>
+            <w:pPr>
+              <w:spacing w:after="0"/>
+            </w:pPr>
+            <w:r/>
+            <w:r>
+              <w:rPr>
+                <w:rFonts w:ascii="Times New Roman" w:hAnsi="Times New Roman"/>
+                <w:sz w:val="18"/>
+              </w:rPr>
+              <w:t xml:space="preserve">3</w:t>
+            </w:r>
+          </w:p>
+        </w:tc>
+        <w:tc>
+          <w:tcPr>
+            <w:tcW w:type="dxa" w:w="3742"/>
+          </w:tcPr>
+          <w:p>
+            <w:pPr>
+              <w:spacing w:after="0"/>
+            </w:pPr>
+            <w:r/>
+            <w:r>
+              <w:rPr>
+                <w:rFonts w:ascii="Times New Roman" w:hAnsi="Times New Roman"/>
+                <w:sz w:val="18"/>
+              </w:rPr>
+              <w:t xml:space="preserve">Columna generada diferencia en los 10 turnos</w:t>
+            </w:r>
+          </w:p>
+        </w:tc>
+        <w:tc>
+          <w:tcPr>
+            <w:tcW w:type="dxa" w:w="3005"/>
+          </w:tcPr>
+          <w:p>
+            <w:pPr>
+              <w:spacing w:after="0"/>
+            </w:pPr>
+            <w:r/>
+            <w:r>
+              <w:rPr>
+                <w:rFonts w:ascii="Times New Roman" w:hAnsi="Times New Roman"/>
+                <w:sz w:val="18"/>
+              </w:rPr>
+              <w:t xml:space="preserve">+500 en el 4, -700 en el 8, 0 en el resto</w:t>
+            </w:r>
+          </w:p>
+        </w:tc>
+        <w:tc>
+          <w:tcPr>
+            <w:tcW w:type="dxa" w:w="1701"/>
+          </w:tcPr>
+          <w:p>
+            <w:pPr>
+              <w:spacing w:after="0"/>
+            </w:pPr>
+            <w:r/>
+            <w:r>
+              <w:rPr>
+                <w:rFonts w:ascii="Times New Roman" w:hAnsi="Times New Roman"/>
+                <w:sz w:val="18"/>
+              </w:rPr>
+              <w:t xml:space="preserve">Cumple; el turno 11 (abierto) queda en NULL</w:t>
+            </w:r>
+          </w:p>
+        </w:tc>
+      </w:tr>
+      <w:tr>
+        <w:tc>
+          <w:tcPr>
+            <w:tcW w:type="dxa" w:w="624"/>
+          </w:tcPr>
+          <w:p>
+            <w:pPr>
+              <w:spacing w:after="0"/>
+            </w:pPr>
+            <w:r/>
+            <w:r>
+              <w:rPr>
+                <w:rFonts w:ascii="Times New Roman" w:hAnsi="Times New Roman"/>
+                <w:sz w:val="18"/>
+              </w:rPr>
+              <w:t xml:space="preserve">4</w:t>
+            </w:r>
+          </w:p>
+        </w:tc>
+        <w:tc>
+          <w:tcPr>
+            <w:tcW w:type="dxa" w:w="3742"/>
+          </w:tcPr>
+          <w:p>
+            <w:pPr>
+              <w:spacing w:after="0"/>
+            </w:pPr>
+            <w:r/>
+            <w:r>
+              <w:rPr>
+                <w:rFonts w:ascii="Times New Roman" w:hAnsi="Times New Roman"/>
+                <w:sz w:val="18"/>
+              </w:rPr>
+              <w:t xml:space="preserve">Stock recalculado desde el kárdex</w:t>
+            </w:r>
+          </w:p>
+        </w:tc>
+        <w:tc>
+          <w:tcPr>
+            <w:tcW w:type="dxa" w:w="3005"/>
+          </w:tcPr>
+          <w:p>
+            <w:pPr>
+              <w:spacing w:after="0"/>
+            </w:pPr>
+            <w:r/>
+            <w:r>
+              <w:rPr>
+                <w:rFonts w:ascii="Times New Roman" w:hAnsi="Times New Roman"/>
+                <w:sz w:val="18"/>
+              </w:rPr>
+              <w:t xml:space="preserve">Ningún stock negativo</w:t>
+            </w:r>
+          </w:p>
+        </w:tc>
+        <w:tc>
+          <w:tcPr>
+            <w:tcW w:type="dxa" w:w="1701"/>
+          </w:tcPr>
+          <w:p>
+            <w:pPr>
+              <w:spacing w:after="0"/>
+            </w:pPr>
+            <w:r/>
+            <w:r>
+              <w:rPr>
+                <w:rFonts w:ascii="Times New Roman" w:hAnsi="Times New Roman"/>
+                <w:sz w:val="18"/>
+              </w:rPr>
+              <w:t xml:space="preserve">Cumple: Leche 53, Café 4 (bajo mínimo), Atún 35…</w:t>
+            </w:r>
+          </w:p>
+        </w:tc>
+      </w:tr>
+      <w:tr>
+        <w:tc>
+          <w:tcPr>
+            <w:tcW w:type="dxa" w:w="624"/>
+          </w:tcPr>
+          <w:p>
+            <w:pPr>
+              <w:spacing w:after="0"/>
+            </w:pPr>
+            <w:r/>
+            <w:r>
+              <w:rPr>
+                <w:rFonts w:ascii="Times New Roman" w:hAnsi="Times New Roman"/>
+                <w:sz w:val="18"/>
+              </w:rPr>
+              <w:t xml:space="preserve">5</w:t>
+            </w:r>
+          </w:p>
+        </w:tc>
+        <w:tc>
+          <w:tcPr>
+            <w:tcW w:type="dxa" w:w="3742"/>
+          </w:tcPr>
+          <w:p>
+            <w:pPr>
+              <w:spacing w:after="0"/>
+            </w:pPr>
+            <w:r/>
+            <w:r>
+              <w:rPr>
+                <w:rFonts w:ascii="Times New Roman" w:hAnsi="Times New Roman"/>
+                <w:sz w:val="18"/>
+              </w:rPr>
+              <w:t xml:space="preserve">Ejecutar el script por segunda vez</w:t>
+            </w:r>
+          </w:p>
+        </w:tc>
+        <w:tc>
+          <w:tcPr>
+            <w:tcW w:type="dxa" w:w="3005"/>
+          </w:tcPr>
+          <w:p>
+            <w:pPr>
+              <w:spacing w:after="0"/>
+            </w:pPr>
+            <w:r/>
+            <w:r>
+              <w:rPr>
+                <w:rFonts w:ascii="Times New Roman" w:hAnsi="Times New Roman"/>
+                <w:sz w:val="18"/>
+              </w:rPr>
+              <w:t xml:space="preserve">Error 1062 y nada agregado</w:t>
+            </w:r>
+          </w:p>
+        </w:tc>
+        <w:tc>
+          <w:tcPr>
+            <w:tcW w:type="dxa" w:w="1701"/>
+          </w:tcPr>
+          <w:p>
+            <w:pPr>
+              <w:spacing w:after="0"/>
+            </w:pPr>
+            <w:r/>
+            <w:r>
+              <w:rPr>
+                <w:rFonts w:ascii="Times New Roman" w:hAnsi="Times New Roman"/>
+                <w:sz w:val="18"/>
+              </w:rPr>
+              <w:t xml:space="preserve">ERROR 1062: Duplicate entry '4' for key 'roles.PRIMARY'</w:t>
+            </w:r>
+          </w:p>
+        </w:tc>
+      </w:tr>
+      <w:tr>
+        <w:tc>
+          <w:tcPr>
+            <w:tcW w:type="dxa" w:w="624"/>
+          </w:tcPr>
+          <w:p>
+            <w:pPr>
+              <w:spacing w:after="0"/>
+            </w:pPr>
+            <w:r/>
+            <w:r>
+              <w:rPr>
+                <w:rFonts w:ascii="Times New Roman" w:hAnsi="Times New Roman"/>
+                <w:sz w:val="18"/>
+              </w:rPr>
+              <w:t xml:space="preserve">6</w:t>
+            </w:r>
+          </w:p>
+        </w:tc>
+        <w:tc>
+          <w:tcPr>
+            <w:tcW w:type="dxa" w:w="3742"/>
+          </w:tcPr>
+          <w:p>
+            <w:pPr>
+              <w:spacing w:after="0"/>
+            </w:pPr>
+            <w:r/>
+            <w:r>
+              <w:rPr>
+                <w:rFonts w:ascii="Times New Roman" w:hAnsi="Times New Roman"/>
+                <w:sz w:val="18"/>
+              </w:rPr>
+              <w:t xml:space="preserve">Guion 02_demostracion_sustentacion.sql completo</w:t>
+            </w:r>
+          </w:p>
+        </w:tc>
+        <w:tc>
+          <w:tcPr>
+            <w:tcW w:type="dxa" w:w="3005"/>
+          </w:tcPr>
+          <w:p>
+            <w:pPr>
+              <w:spacing w:after="0"/>
+            </w:pPr>
+            <w:r/>
+            <w:r>
+              <w:rPr>
+                <w:rFonts w:ascii="Times New Roman" w:hAnsi="Times New Roman"/>
+                <w:sz w:val="18"/>
+              </w:rPr>
+              <w:t xml:space="preserve">Mismos resultados que el guion espera</w:t>
+            </w:r>
+          </w:p>
+        </w:tc>
+        <w:tc>
+          <w:tcPr>
+            <w:tcW w:type="dxa" w:w="1701"/>
+          </w:tcPr>
+          <w:p>
+            <w:pPr>
+              <w:spacing w:after="0"/>
+            </w:pPr>
+            <w:r/>
+            <w:r>
+              <w:rPr>
+                <w:rFonts w:ascii="Times New Roman" w:hAnsi="Times New Roman"/>
+                <w:sz w:val="18"/>
+              </w:rPr>
+              <w:t xml:space="preserve">Cumple; la prueba final da el error 1452 esperado</w:t>
+            </w:r>
+          </w:p>
+        </w:tc>
+      </w:tr>
+    </w:tbl>
+    <w:p>
+      <w:pPr>
+        <w:spacing w:before="60" w:after="240"/>
+        <w:jc w:val="both"/>
+      </w:pPr>
+      <w:r>
+        <w:rPr>
+          <w:rFonts w:ascii="Times New Roman" w:hAnsi="Times New Roman"/>
+          <w:i/>
+          <w:sz w:val="20"/>
+        </w:rPr>
+        <w:t xml:space="preserve">Nota. </w:t>
+      </w:r>
+      <w:r>
+        <w:rPr>
+          <w:rFonts w:ascii="Times New Roman" w:hAnsi="Times New Roman"/>
+          <w:sz w:val="20"/>
+        </w:rPr>
+        <w:t xml:space="preserve"> Pruebas ejecutadas el 25 de septiembre de 2026 en una instancia temporal de MySQL 8.4.9 cargada con el volcado del 23 de septiembre.</w:t>
+      </w:r>
+    </w:p>
+    <w:p>
+      <w:pPr>
+        <w:spacing w:line="240" w:lineRule="auto" w:before="280" w:after="160"/>
+        <w:jc w:val="center"/>
+      </w:pPr>
+      <w:r>
+        <w:rPr>
+          <w:rFonts w:ascii="Times New Roman" w:hAnsi="Times New Roman"/>
+          <w:b/>
+          <w:sz w:val="24"/>
+        </w:rPr>
         <w:t>Conclusión</w:t>
       </w:r>
     </w:p>
@@ -5134,7 +6907,7 @@
           <w:i w:val="0"/>
           <w:sz w:val="24"/>
         </w:rPr>
-        <w:t>El resultado es un esquema de catorce tablas que cumple la Tercera Forma Normal sin excepciones, cuyos datos derivados se encuentran protegidos por columnas generadas y disparadores verificados, y cuya evolución completa queda registrada en este documento junto con los scripts y respaldos que la respaldan.</w:t>
+        <w:t>El resultado es un esquema de catorce tablas que cumple la Tercera Forma Normal sin excepciones, cuyos datos derivados se encuentran protegidos por columnas generadas y disparadores verificados, y cuya evolución completa queda registrada en este documento junto con los scripts y respaldos que la respaldan. Desde el 25 de septiembre cuenta además con un script de datos que deja al menos diez registros en cada tabla, probado antes de ejecutarse en la base.</w:t>
       </w:r>
     </w:p>
     <w:p>

</xml_diff>